<commit_message>
vault backup: 2026-08-23 01:57:51
</commit_message>
<xml_diff>
--- a/Investigare/Avventura Richiamo/RICHIAMO_Libro_GM.docx
+++ b/Investigare/Avventura Richiamo/RICHIAMO_Libro_GM.docx
@@ -515,7 +515,17 @@
       </w:r>
       <w:r>
         <w:rPr/>
-        <w:t>: GENKAI — Lo Scontro/Shōtotsu v2.1 + tiri standard (2d6 ≤ attributo) e pressioni che costano Ki. In questa one-shot: niente Gou, Kage meccanico, Enja, soroban.</w:t>
+        <w:t xml:space="preserve">: GENKAI — Lo Scontro/Shōtotsu v2.1 + tiri standard (2d6 ≤ attributo) e pressioni che costano Ki. </w:t>
+      </w:r>
+      <w:r>
+        <w:rPr>
+          <w:b/>
+        </w:rPr>
+        <w:t>I Gou si usano normalmente</w:t>
+      </w:r>
+      <w:r>
+        <w:rPr/>
+        <w:t xml:space="preserve"> (ogni pregen ne ha uno). Kage meccanico e soroban restano fuori; le telefonate del cap. 12 sono scene libere.</w:t>
       </w:r>
     </w:p>
     <w:p>
@@ -36123,7 +36133,7 @@
           <w:color w:val="555555"/>
           <w:sz w:val="19"/>
         </w:rPr>
-        <w:t>Solo GM · una telefonata a testa, da piazzare nel momento peggiore (prima di un’operazione, la sera al telefono del comando). Scene da un minuto: nessuna meccanica, nessuna data. Honda e Fujita non hanno famiglia nei Kage — vedono le chiamate degli altri, e anche quello dice qualcosa.</w:t>
+        <w:t>Scene da un minuto: nessuna meccanica, nessuna data. Honda e Fujita non hanno famiglia nei Kage — vedono le chiamate degli altri, e anche quello dice qualcosa.</w:t>
       </w:r>
     </w:p>
     <w:p>
@@ -36147,11 +36157,17 @@
         <w:rPr>
           <w:b/>
         </w:rPr>
-        <w:t xml:space="preserve">A chi lo interpreta:  </w:t>
+        <w:t xml:space="preserve">A chi lo </w:t>
+      </w:r>
+      <w:r>
+        <w:rPr>
+          <w:b/>
+        </w:rPr>
+        <w:t>interpreta: sei</w:t>
       </w:r>
       <w:r>
         <w:rPr/>
-        <w:t>sei un bambino. Frasi corte, silenzi lunghi. Hai visto il mostro alla televisione; la zia Noriko ti ha fatto il numero. Vuoi una cosa sola: sentire papà — e che rimanga al telefono.</w:t>
+        <w:t xml:space="preserve"> un bambino. Frasi corte, silenzi lunghi. Hai visto il mostro alla televisione; la zia Noriko ti ha fatto il numero. Vuoi una cosa sola: sentire papà — e che rimanga al telefono.</w:t>
       </w:r>
     </w:p>
     <w:p>
@@ -36162,11 +36178,11 @@
         <w:rPr>
           <w:b/>
         </w:rPr>
-        <w:t xml:space="preserve">Frasi:  </w:t>
+        <w:t>Frasi: «</w:t>
       </w:r>
       <w:r>
         <w:rPr/>
-        <w:t>«Alla TV dicono che il mostro fa esplodere le cose. Tu sei lontano, vero? Dimmi che sei lontano.» · «Quando torni?» · (se papà ha fretta) «Devi andare, vero? Vai. Tanto lo so.»</w:t>
+        <w:t>Alla TV dicono che il mostro fa esplodere le cose. Tu sei lontano, vero? Dimmi che sei lontano.» · «Quando torni?» · (se papà ha fretta) «Devi andare, vero? Vai. Tanto lo so.»</w:t>
       </w:r>
     </w:p>
     <w:p>
@@ -36177,11 +36193,17 @@
         <w:rPr>
           <w:b/>
         </w:rPr>
-        <w:t xml:space="preserve">Al giocatore di Yamamoto:  </w:t>
+        <w:t xml:space="preserve">Al giocatore di </w:t>
+      </w:r>
+      <w:r>
+        <w:rPr>
+          <w:b/>
+        </w:rPr>
+        <w:t>Yamamoto: non</w:t>
       </w:r>
       <w:r>
         <w:rPr/>
-        <w:t>non sei lontano. Gli menti, o no?</w:t>
+        <w:t xml:space="preserve"> sei lontano. Gli menti, o no?</w:t>
       </w:r>
     </w:p>
     <w:p>
@@ -36192,11 +36214,11 @@
         <w:rPr>
           <w:b/>
         </w:rPr>
-        <w:t xml:space="preserve">GM:  </w:t>
+        <w:t>Suggerimento: non</w:t>
       </w:r>
       <w:r>
         <w:rPr/>
-        <w:t>non c’è risposta giusta — conta se trova i due minuti. E la squadra sente tutto.</w:t>
+        <w:t xml:space="preserve"> c’è risposta giusta — conta se trova i due minuti. E la squadra sente tutto.</w:t>
       </w:r>
     </w:p>
     <w:p>
@@ -36220,11 +36242,17 @@
         <w:rPr>
           <w:b/>
         </w:rPr>
-        <w:t xml:space="preserve">A chi la interpreta:  </w:t>
+        <w:t xml:space="preserve">A chi la </w:t>
+      </w:r>
+      <w:r>
+        <w:rPr>
+          <w:b/>
+        </w:rPr>
+        <w:t>interpreta: calma</w:t>
       </w:r>
       <w:r>
         <w:rPr/>
-        <w:t>calma, domande precise da maestra, niente scenate. Alla fine, la richiesta — l’unica cosa che vuoi davvero.</w:t>
+        <w:t>, domande precise da maestra, niente scenate. Alla fine, la richiesta — l’unica cosa che vuoi davvero.</w:t>
       </w:r>
     </w:p>
     <w:p>
@@ -36235,11 +36263,11 @@
         <w:rPr>
           <w:b/>
         </w:rPr>
-        <w:t xml:space="preserve">Frasi:  </w:t>
+        <w:t>Frasi: «</w:t>
       </w:r>
       <w:r>
         <w:rPr/>
-        <w:t>«Ho visto il telegiornale. Cosa vi fanno fare, esattamente? E non dirmi “indagini”.» · «Torna. Non fare l’eroe, Shota. Promettimelo.»</w:t>
+        <w:t>Ho visto il telegiornale. Cosa vi fanno fare, esattamente? E non dirmi “indagini”.» · «Torna. Non fare l’eroe, Shota. Promettimelo.»</w:t>
       </w:r>
     </w:p>
     <w:p>
@@ -36250,11 +36278,17 @@
         <w:rPr>
           <w:b/>
         </w:rPr>
-        <w:t xml:space="preserve">Al giocatore di Nakamura:  </w:t>
+        <w:t xml:space="preserve">Al giocatore di </w:t>
+      </w:r>
+      <w:r>
+        <w:rPr>
+          <w:b/>
+        </w:rPr>
+        <w:t>Nakamura: sai</w:t>
       </w:r>
       <w:r>
         <w:rPr/>
-        <w:t>sai cosa ti aspetta domani. Puoi prometterlo onestamente?</w:t>
+        <w:t xml:space="preserve"> cosa ti aspetta domani. Puoi prometterlo onestamente?</w:t>
       </w:r>
     </w:p>
     <w:p>
@@ -36265,11 +36299,11 @@
         <w:rPr>
           <w:b/>
         </w:rPr>
-        <w:t xml:space="preserve">GM:  </w:t>
+        <w:t>Suggerimento: se</w:t>
       </w:r>
       <w:r>
         <w:rPr/>
-        <w:t>se promette troppo in fretta, lei lo sente: «...L’hai detto troppo in fretta.» — e riattacca lei per prima.</w:t>
+        <w:t xml:space="preserve"> promette troppo in fretta, lei lo sente: «...L’hai detto troppo in fretta.» — e riattacca lei per prima.</w:t>
       </w:r>
     </w:p>
     <w:p>
@@ -36293,11 +36327,17 @@
         <w:rPr>
           <w:b/>
         </w:rPr>
-        <w:t xml:space="preserve">A chi la interpreta:  </w:t>
+        <w:t xml:space="preserve">A chi la </w:t>
+      </w:r>
+      <w:r>
+        <w:rPr>
+          <w:b/>
+        </w:rPr>
+        <w:t>interpreta: apprensiva</w:t>
       </w:r>
       <w:r>
         <w:rPr/>
-        <w:t>apprensiva, affettuosa, ogni frase ha due livelli. Per te Yuki lavora «in laboratorio, tranquillo» — non hai motivo di dubitarne.</w:t>
+        <w:t>, affettuosa, ogni frase ha due livelli. Per te Yuki lavora «in laboratorio, tranquillo» — non hai motivo di dubitarne.</w:t>
       </w:r>
     </w:p>
     <w:p>
@@ -36308,11 +36348,11 @@
         <w:rPr>
           <w:b/>
         </w:rPr>
-        <w:t xml:space="preserve">Frasi:  </w:t>
+        <w:t>Frasi: «</w:t>
       </w:r>
       <w:r>
         <w:rPr/>
-        <w:t>«Hai visto che cosa terribile? Quei poveri ragazzi che mandano là...» · «Meno male che tu stai in laboratorio. Almeno questo.» · «Mangi? Con queste cose che succedono, la gente si dimentica di mangiare.»</w:t>
+        <w:t>Hai visto che cosa terribile? Quei poveri ragazzi che mandano là...» · «Meno male che tu stai in laboratorio. Almeno questo.» · «Mangi? Con queste cose che succedono, la gente si dimentica di mangiare.»</w:t>
       </w:r>
     </w:p>
     <w:p>
@@ -36323,11 +36363,17 @@
         <w:rPr>
           <w:b/>
         </w:rPr>
-        <w:t xml:space="preserve">Al giocatore di Sato:  </w:t>
+        <w:t xml:space="preserve">Al giocatore di </w:t>
+      </w:r>
+      <w:r>
+        <w:rPr>
+          <w:b/>
+        </w:rPr>
+        <w:t>Sato: sei</w:t>
       </w:r>
       <w:r>
         <w:rPr/>
-        <w:t>sei al comando dell’emergenza, con la squadra intorno. Assecondi la bugia — di nuovo?</w:t>
+        <w:t xml:space="preserve"> al comando dell’emergenza, con la squadra intorno. Assecondi la bugia — di nuovo?</w:t>
       </w:r>
     </w:p>
     <w:p>
@@ -36338,7 +36384,11 @@
         <w:rPr>
           <w:b/>
         </w:rPr>
-        <w:t xml:space="preserve">GM (opzione, se vuoi il colpo):  </w:t>
+        <w:t>Suggerimento</w:t>
+      </w:r>
+      <w:r>
+        <w:rPr/>
+        <w:t xml:space="preserve">: </w:t>
       </w:r>
       <w:r>
         <w:rPr/>

</xml_diff>

<commit_message>
vault backup: 2026-08-23 16:38:43
</commit_message>
<xml_diff>
--- a/Investigare/Avventura Richiamo/RICHIAMO_Libro_GM.docx
+++ b/Investigare/Avventura Richiamo/RICHIAMO_Libro_GM.docx
@@ -1632,13 +1632,83 @@
           <w:b/>
           <w:sz w:val="20"/>
         </w:rPr>
-        <w:t>Un camioncino demolito</w:t>
-      </w:r>
-      <w:r>
-        <w:rPr>
-          <w:sz w:val="20"/>
-        </w:rPr>
-        <w:t xml:space="preserve"> = il Kaiju passa al punto successivo (dipende sempre dal percorso).</w:t>
+        <w:t>Due camioncini per centrale</w:t>
+      </w:r>
+      <w:r>
+        <w:rPr>
+          <w:sz w:val="20"/>
+        </w:rPr>
+        <w:t xml:space="preserve"> </w:t>
+      </w:r>
+      <w:r>
+        <w:rPr>
+          <w:i/>
+          <w:sz w:val="20"/>
+        </w:rPr>
+        <w:t>(canone 2026-08-23)</w:t>
+      </w:r>
+      <w:r>
+        <w:rPr>
+          <w:sz w:val="20"/>
+        </w:rPr>
+        <w:t xml:space="preserve">: il faro + il mezzo di supporto. </w:t>
+      </w:r>
+      <w:r>
+        <w:rPr>
+          <w:b/>
+          <w:sz w:val="20"/>
+        </w:rPr>
+        <w:t>Zittiti entrambi</w:t>
+      </w:r>
+      <w:r>
+        <w:rPr>
+          <w:sz w:val="20"/>
+        </w:rPr>
+        <w:t xml:space="preserve"> = centrale salvata, il Kaiju passa al punto successivo (dipende sempre dal percorso).</w:t>
+      </w:r>
+    </w:p>
+    <w:p>
+      <w:pPr>
+        <w:pStyle w:val="ListBullet"/>
+        <w:spacing w:after="40"/>
+      </w:pPr>
+      <w:r>
+        <w:rPr>
+          <w:b/>
+          <w:sz w:val="20"/>
+        </w:rPr>
+        <w:t>Ogni camioncino è imbottito d'esplosivo</w:t>
+      </w:r>
+      <w:r>
+        <w:rPr>
+          <w:sz w:val="20"/>
+        </w:rPr>
+        <w:t xml:space="preserve">: se scoperti e alle strette, i mercenari </w:t>
+      </w:r>
+      <w:r>
+        <w:rPr>
+          <w:b/>
+          <w:sz w:val="20"/>
+        </w:rPr>
+        <w:t>attivano la demolizione — un minuto — e scappano</w:t>
+      </w:r>
+      <w:r>
+        <w:rPr>
+          <w:sz w:val="20"/>
+        </w:rPr>
+        <w:t xml:space="preserve"> (cancella le prove). Esame di un mezzo preso intero: handout </w:t>
+      </w:r>
+      <w:r>
+        <w:rPr>
+          <w:sz w:val="20"/>
+        </w:rPr>
+        <w:t>HANDOUT_CAMIONCINO.html</w:t>
+      </w:r>
+      <w:r>
+        <w:rPr>
+          <w:sz w:val="20"/>
+        </w:rPr>
+        <w:t>.</w:t>
       </w:r>
     </w:p>
     <w:p>
@@ -16611,9 +16681,10 @@
             </w:pPr>
             <w:r>
               <w:rPr>
-                <w:sz w:val="17"/>
-              </w:rPr>
-              <w:t>Il parcheggio</w:t>
+                <w:b/>
+                <w:sz w:val="17"/>
+              </w:rPr>
+              <w:t>La carica</w:t>
             </w:r>
           </w:p>
         </w:tc>
@@ -16627,35 +16698,42 @@
             </w:pPr>
             <w:r>
               <w:rPr>
-                <w:sz w:val="17"/>
-              </w:rPr>
-              <w:t xml:space="preserve">Sempre </w:t>
-            </w:r>
-            <w:r>
-              <w:rPr>
                 <w:b/>
                 <w:sz w:val="17"/>
               </w:rPr>
-              <w:t>accoppiato all'acqua o al suolo</w:t>
-            </w:r>
-            <w:r>
-              <w:rPr>
-                <w:sz w:val="17"/>
-              </w:rPr>
-              <w:t xml:space="preserve">: su tombini e canali, su ponticelli, sulle banchine dei porti — l'infrasuono si trasmette meglio. È anche un </w:t>
-            </w:r>
-            <w:r>
-              <w:rPr>
-                <w:i/>
-                <w:sz w:val="17"/>
-              </w:rPr>
-              <w:t>pattern</w:t>
-            </w:r>
-            <w:r>
-              <w:rPr>
-                <w:sz w:val="17"/>
-              </w:rPr>
-              <w:t xml:space="preserve"> riconoscibile</w:t>
+              <w:t>Ogni camioncino è imbottito d'esplosivo</w:t>
+            </w:r>
+            <w:r>
+              <w:rPr>
+                <w:sz w:val="17"/>
+              </w:rPr>
+              <w:t xml:space="preserve"> (intercapedine del pianale): serve a </w:t>
+            </w:r>
+            <w:r>
+              <w:rPr>
+                <w:b/>
+                <w:sz w:val="17"/>
+              </w:rPr>
+              <w:t>farlo saltare e cancellare le prove</w:t>
+            </w:r>
+            <w:r>
+              <w:rPr>
+                <w:sz w:val="17"/>
+              </w:rPr>
+              <w:t xml:space="preserve">. Se scoperti e alle strette, i mercenari </w:t>
+            </w:r>
+            <w:r>
+              <w:rPr>
+                <w:b/>
+                <w:sz w:val="17"/>
+              </w:rPr>
+              <w:t>attivano la demolizione — un minuto di timer — e scappano</w:t>
+            </w:r>
+            <w:r>
+              <w:rPr>
+                <w:sz w:val="17"/>
+              </w:rPr>
+              <w:t>. Per questo un camion preso intero è raro e prezioso</w:t>
             </w:r>
           </w:p>
         </w:tc>
@@ -16669,9 +16747,10 @@
             </w:pPr>
             <w:r>
               <w:rPr>
-                <w:sz w:val="17"/>
-              </w:rPr>
-              <w:t>proposta</w:t>
+                <w:b/>
+                <w:sz w:val="17"/>
+              </w:rPr>
+              <w:t>canone utente 2026-08-23</w:t>
             </w:r>
           </w:p>
         </w:tc>
@@ -16689,7 +16768,7 @@
               <w:rPr>
                 <w:sz w:val="17"/>
               </w:rPr>
-              <w:t>La guardia</w:t>
+              <w:t>Il parcheggio</w:t>
             </w:r>
           </w:p>
         </w:tc>
@@ -16705,33 +16784,33 @@
               <w:rPr>
                 <w:sz w:val="17"/>
               </w:rPr>
-              <w:t xml:space="preserve">Sulle telecamere si vedono </w:t>
+              <w:t xml:space="preserve">Sempre </w:t>
             </w:r>
             <w:r>
               <w:rPr>
                 <w:b/>
                 <w:sz w:val="17"/>
               </w:rPr>
-              <w:t>operai</w:t>
-            </w:r>
-            <w:r>
-              <w:rPr>
-                <w:sz w:val="17"/>
-              </w:rPr>
-              <w:t xml:space="preserve">. In realtà sono </w:t>
-            </w:r>
-            <w:r>
-              <w:rPr>
-                <w:b/>
-                <w:sz w:val="17"/>
-              </w:rPr>
-              <w:t>mercenari</w:t>
-            </w:r>
-            <w:r>
-              <w:rPr>
-                <w:sz w:val="17"/>
-              </w:rPr>
-              <w:t>: presidiano a vista da un secondo punto (una stanza in affitto, un furgone, un finto rilievo topografico)</w:t>
+              <w:t>accoppiato all'acqua o al suolo</w:t>
+            </w:r>
+            <w:r>
+              <w:rPr>
+                <w:sz w:val="17"/>
+              </w:rPr>
+              <w:t xml:space="preserve">: su tombini e canali, su ponticelli, sulle banchine dei porti — l'infrasuono si trasmette meglio. È anche un </w:t>
+            </w:r>
+            <w:r>
+              <w:rPr>
+                <w:i/>
+                <w:sz w:val="17"/>
+              </w:rPr>
+              <w:t>pattern</w:t>
+            </w:r>
+            <w:r>
+              <w:rPr>
+                <w:sz w:val="17"/>
+              </w:rPr>
+              <w:t xml:space="preserve"> riconoscibile</w:t>
             </w:r>
           </w:p>
         </w:tc>
@@ -16747,7 +16826,7 @@
               <w:rPr>
                 <w:sz w:val="17"/>
               </w:rPr>
-              <w:t>canone</w:t>
+              <w:t>proposta</w:t>
             </w:r>
           </w:p>
         </w:tc>
@@ -16765,7 +16844,7 @@
               <w:rPr>
                 <w:sz w:val="17"/>
               </w:rPr>
-              <w:t>La finestra di scoperta</w:t>
+              <w:t>La guardia</w:t>
             </w:r>
           </w:p>
         </w:tc>
@@ -16779,16 +16858,35 @@
             </w:pPr>
             <w:r>
               <w:rPr>
+                <w:sz w:val="17"/>
+              </w:rPr>
+              <w:t xml:space="preserve">Sulle telecamere si vedono </w:t>
+            </w:r>
+            <w:r>
+              <w:rPr>
                 <w:b/>
                 <w:sz w:val="17"/>
               </w:rPr>
-              <w:t>Finché il faro trasmette — cioè finché il mostro non gli arriva addosso — si può captare e scoprire</w:t>
-            </w:r>
-            <w:r>
-              <w:rPr>
-                <w:sz w:val="17"/>
-              </w:rPr>
-              <w:t>. Dopo, tace per sempre (schiacciato) e canta il successivo</w:t>
+              <w:t>operai</w:t>
+            </w:r>
+            <w:r>
+              <w:rPr>
+                <w:sz w:val="17"/>
+              </w:rPr>
+              <w:t xml:space="preserve">. In realtà sono </w:t>
+            </w:r>
+            <w:r>
+              <w:rPr>
+                <w:b/>
+                <w:sz w:val="17"/>
+              </w:rPr>
+              <w:t>mercenari</w:t>
+            </w:r>
+            <w:r>
+              <w:rPr>
+                <w:sz w:val="17"/>
+              </w:rPr>
+              <w:t>: presidiano a vista da un secondo punto (una stanza in affitto, un furgone, un finto rilievo topografico)</w:t>
             </w:r>
           </w:p>
         </w:tc>
@@ -16804,7 +16902,7 @@
               <w:rPr>
                 <w:sz w:val="17"/>
               </w:rPr>
-              <w:t>canone («finché il mostro non passa possono scoprirla»)</w:t>
+              <w:t>canone</w:t>
             </w:r>
           </w:p>
         </w:tc>
@@ -16822,7 +16920,7 @@
               <w:rPr>
                 <w:sz w:val="17"/>
               </w:rPr>
-              <w:t>La reazione</w:t>
+              <w:t>La finestra di scoperta</w:t>
             </w:r>
           </w:p>
         </w:tc>
@@ -16836,61 +16934,16 @@
             </w:pPr>
             <w:r>
               <w:rPr>
-                <w:sz w:val="17"/>
-              </w:rPr>
-              <w:t xml:space="preserve">A un'attenta osservazione o se arriva qualcuno sul posto (polizia o altro) e nascono problemi: </w:t>
-            </w:r>
-            <w:r>
-              <w:rPr>
                 <w:b/>
                 <w:sz w:val="17"/>
               </w:rPr>
-              <w:t>rispondono al fuoco</w:t>
-            </w:r>
-            <w:r>
-              <w:rPr>
-                <w:sz w:val="17"/>
-              </w:rPr>
-              <w:t xml:space="preserve"> e </w:t>
-            </w:r>
-            <w:r>
-              <w:rPr>
-                <w:b/>
-                <w:sz w:val="17"/>
-              </w:rPr>
-              <w:t>spostano il camioncino più avanti, sempre sulla linea</w:t>
-            </w:r>
-            <w:r>
-              <w:rPr>
-                <w:sz w:val="17"/>
-              </w:rPr>
-              <w:t xml:space="preserve"> — vale per i camion </w:t>
-            </w:r>
-            <w:r>
-              <w:rPr>
-                <w:b/>
-                <w:sz w:val="17"/>
-              </w:rPr>
-              <w:t>non ancora attivi</w:t>
-            </w:r>
-            <w:r>
-              <w:rPr>
-                <w:sz w:val="17"/>
-              </w:rPr>
-              <w:t xml:space="preserve">. Quello attivo è fermo, accoppiato al suolo e comunque condannato: la guardia lo difende dalla polizia e </w:t>
-            </w:r>
-            <w:r>
-              <w:rPr>
-                <w:b/>
-                <w:sz w:val="17"/>
-              </w:rPr>
-              <w:t>sgombera nelle ultime ore</w:t>
-            </w:r>
-            <w:r>
-              <w:rPr>
-                <w:sz w:val="17"/>
-              </w:rPr>
-              <w:t>, quando la bestia è vicina</w:t>
+              <w:t>Finché il faro trasmette — cioè finché il mostro non gli arriva addosso — si può captare e scoprire</w:t>
+            </w:r>
+            <w:r>
+              <w:rPr>
+                <w:sz w:val="17"/>
+              </w:rPr>
+              <w:t>. Dopo, tace per sempre (schiacciato) e canta il successivo</w:t>
             </w:r>
           </w:p>
         </w:tc>
@@ -16906,7 +16959,7 @@
               <w:rPr>
                 <w:sz w:val="17"/>
               </w:rPr>
-              <w:t>canone; la nota sull'attivo: proposta</w:t>
+              <w:t>canone («finché il mostro non passa possono scoprirla»)</w:t>
             </w:r>
           </w:p>
         </w:tc>
@@ -16922,10 +16975,77 @@
             </w:pPr>
             <w:r>
               <w:rPr>
+                <w:sz w:val="17"/>
+              </w:rPr>
+              <w:t>La reazione</w:t>
+            </w:r>
+          </w:p>
+        </w:tc>
+        <w:tc>
+          <w:tcPr>
+            <w:tcW w:type="dxa" w:w="3475"/>
+          </w:tcPr>
+          <w:p>
+            <w:pPr>
+              <w:spacing w:after="20"/>
+            </w:pPr>
+            <w:r>
+              <w:rPr>
+                <w:sz w:val="17"/>
+              </w:rPr>
+              <w:t xml:space="preserve">A un'attenta osservazione o se arriva qualcuno sul posto (polizia o altro) e nascono problemi: </w:t>
+            </w:r>
+            <w:r>
+              <w:rPr>
                 <w:b/>
                 <w:sz w:val="17"/>
               </w:rPr>
-              <w:t>La sequenza</w:t>
+              <w:t>rispondono al fuoco</w:t>
+            </w:r>
+            <w:r>
+              <w:rPr>
+                <w:sz w:val="17"/>
+              </w:rPr>
+              <w:t xml:space="preserve"> e </w:t>
+            </w:r>
+            <w:r>
+              <w:rPr>
+                <w:b/>
+                <w:sz w:val="17"/>
+              </w:rPr>
+              <w:t>spostano il camioncino più avanti, sempre sulla linea</w:t>
+            </w:r>
+            <w:r>
+              <w:rPr>
+                <w:sz w:val="17"/>
+              </w:rPr>
+              <w:t xml:space="preserve"> — vale per i camion </w:t>
+            </w:r>
+            <w:r>
+              <w:rPr>
+                <w:b/>
+                <w:sz w:val="17"/>
+              </w:rPr>
+              <w:t>non ancora attivi</w:t>
+            </w:r>
+            <w:r>
+              <w:rPr>
+                <w:sz w:val="17"/>
+              </w:rPr>
+              <w:t xml:space="preserve">. Quello attivo è fermo, accoppiato al suolo e comunque condannato: la guardia lo difende dalla polizia e </w:t>
+            </w:r>
+            <w:r>
+              <w:rPr>
+                <w:b/>
+                <w:sz w:val="17"/>
+              </w:rPr>
+              <w:t>sgombera nelle ultime ore</w:t>
+            </w:r>
+            <w:r>
+              <w:rPr>
+                <w:sz w:val="17"/>
+              </w:rPr>
+              <w:t>, quando la bestia è vicina</w:t>
             </w:r>
           </w:p>
         </w:tc>
@@ -16939,85 +17059,9 @@
             </w:pPr>
             <w:r>
               <w:rPr>
-                <w:b/>
-                <w:sz w:val="17"/>
-              </w:rPr>
-              <w:t>Tutti i camion sono già posizionati; trasmette UNO alla volta.</w:t>
-            </w:r>
-            <w:r>
-              <w:rPr>
-                <w:sz w:val="17"/>
-              </w:rPr>
-              <w:t xml:space="preserve"> Il primo era </w:t>
-            </w:r>
-            <w:r>
-              <w:rPr>
-                <w:b/>
-                <w:sz w:val="17"/>
-              </w:rPr>
-              <w:t>alla centrale di Genkai</w:t>
-            </w:r>
-            <w:r>
-              <w:rPr>
-                <w:sz w:val="17"/>
-              </w:rPr>
-              <w:t xml:space="preserve">. Quando il camion attivo viene </w:t>
-            </w:r>
-            <w:r>
-              <w:rPr>
-                <w:b/>
-                <w:sz w:val="17"/>
-              </w:rPr>
-              <w:t>distrutto dal mostro</w:t>
-            </w:r>
-            <w:r>
-              <w:rPr>
-                <w:sz w:val="17"/>
-              </w:rPr>
-              <w:t xml:space="preserve"> — che arriva dritto sul suo faro e lo calpesta — </w:t>
-            </w:r>
-            <w:r>
-              <w:rPr>
-                <w:b/>
-                <w:sz w:val="17"/>
-              </w:rPr>
-              <w:t>gli operai al furgone successivo accendono a mano il proprio</w:t>
-            </w:r>
-            <w:r>
-              <w:rPr>
-                <w:sz w:val="17"/>
-              </w:rPr>
-              <w:t xml:space="preserve">. Ogni camion è </w:t>
-            </w:r>
-            <w:r>
-              <w:rPr>
-                <w:b/>
-                <w:sz w:val="17"/>
-              </w:rPr>
-              <w:t>sacrificale</w:t>
-            </w:r>
-            <w:r>
-              <w:rPr>
-                <w:sz w:val="17"/>
-              </w:rPr>
-              <w:t>: canta da quando si accende a quando muore sotto la bestia</w:t>
-            </w:r>
-          </w:p>
-        </w:tc>
-        <w:tc>
-          <w:tcPr>
-            <w:tcW w:type="dxa" w:w="3475"/>
-          </w:tcPr>
-          <w:p>
-            <w:pPr>
-              <w:spacing w:after="20"/>
-            </w:pPr>
-            <w:r>
-              <w:rPr>
-                <w:b/>
-                <w:sz w:val="17"/>
-              </w:rPr>
-              <w:t>canone utente 2026-08-19</w:t>
+                <w:sz w:val="17"/>
+              </w:rPr>
+              <w:t>canone; la nota sull'attivo: proposta</w:t>
             </w:r>
           </w:p>
         </w:tc>
@@ -17036,7 +17080,7 @@
                 <w:b/>
                 <w:sz w:val="17"/>
               </w:rPr>
-              <w:t>Un faro per ogni centrale</w:t>
+              <w:t>La sequenza</w:t>
             </w:r>
           </w:p>
         </w:tc>
@@ -17050,48 +17094,68 @@
             </w:pPr>
             <w:r>
               <w:rPr>
-                <w:sz w:val="17"/>
-              </w:rPr>
-              <w:t xml:space="preserve">Il percorso passa per </w:t>
-            </w:r>
-            <w:r>
-              <w:rPr>
                 <w:b/>
                 <w:sz w:val="17"/>
               </w:rPr>
-              <w:t>ogni centrale nucleare</w:t>
-            </w:r>
-            <w:r>
-              <w:rPr>
-                <w:sz w:val="17"/>
-              </w:rPr>
-              <w:t xml:space="preserve"> e, se nessuno la ferma, </w:t>
+              <w:t>Tutti i camion sono già posizionati; trasmette UNO alla volta.</w:t>
+            </w:r>
+            <w:r>
+              <w:rPr>
+                <w:sz w:val="17"/>
+              </w:rPr>
+              <w:t xml:space="preserve"> Il primo era </w:t>
             </w:r>
             <w:r>
               <w:rPr>
                 <w:b/>
                 <w:sz w:val="17"/>
               </w:rPr>
-              <w:t>le distrugge tutte e otto</w:t>
-            </w:r>
-            <w:r>
-              <w:rPr>
-                <w:sz w:val="17"/>
-              </w:rPr>
-              <w:t xml:space="preserve"> (canone utente 2026-08-20): un faro a Genkai, Shimane, Takahama, Ōi, Mihama, Fugen, Tsuruga, Kashiwazaki — più le riserve. Le uniche deviazioni della rotta non sono scelte dei fari: sono </w:t>
+              <w:t>alla centrale di Genkai</w:t>
+            </w:r>
+            <w:r>
+              <w:rPr>
+                <w:sz w:val="17"/>
+              </w:rPr>
+              <w:t xml:space="preserve">. Quando il camion attivo viene </w:t>
             </w:r>
             <w:r>
               <w:rPr>
                 <w:b/>
                 <w:sz w:val="17"/>
               </w:rPr>
-              <w:t>il fastidio delle centrali termoelettriche</w:t>
-            </w:r>
-            <w:r>
-              <w:rPr>
-                <w:sz w:val="17"/>
-              </w:rPr>
-              <w:t xml:space="preserve"> (Karatsu g.1, Miyazu g.3 — scheda §6.2)</w:t>
+              <w:t>distrutto dal mostro</w:t>
+            </w:r>
+            <w:r>
+              <w:rPr>
+                <w:sz w:val="17"/>
+              </w:rPr>
+              <w:t xml:space="preserve"> — che arriva dritto sul suo faro e lo calpesta — </w:t>
+            </w:r>
+            <w:r>
+              <w:rPr>
+                <w:b/>
+                <w:sz w:val="17"/>
+              </w:rPr>
+              <w:t>gli operai al furgone successivo accendono a mano il proprio</w:t>
+            </w:r>
+            <w:r>
+              <w:rPr>
+                <w:sz w:val="17"/>
+              </w:rPr>
+              <w:t xml:space="preserve">. Ogni camion è </w:t>
+            </w:r>
+            <w:r>
+              <w:rPr>
+                <w:b/>
+                <w:sz w:val="17"/>
+              </w:rPr>
+              <w:t>sacrificale</w:t>
+            </w:r>
+            <w:r>
+              <w:rPr>
+                <w:sz w:val="17"/>
+              </w:rPr>
+              <w:t>: canta da quando si accende a quando muore sotto la bestia</w:t>
             </w:r>
           </w:p>
         </w:tc>
@@ -17105,9 +17169,10 @@
             </w:pPr>
             <w:r>
               <w:rPr>
-                <w:sz w:val="17"/>
-              </w:rPr>
-              <w:t>canone</w:t>
+                <w:b/>
+                <w:sz w:val="17"/>
+              </w:rPr>
+              <w:t>canone utente 2026-08-19</w:t>
             </w:r>
           </w:p>
         </w:tc>
@@ -17126,7 +17191,7 @@
                 <w:b/>
                 <w:sz w:val="17"/>
               </w:rPr>
-              <w:t>Senza spegnimento</w:t>
+              <w:t>Un faro per ogni centrale</w:t>
             </w:r>
           </w:p>
         </w:tc>
@@ -17140,42 +17205,48 @@
             </w:pPr>
             <w:r>
               <w:rPr>
+                <w:sz w:val="17"/>
+              </w:rPr>
+              <w:t xml:space="preserve">Il percorso passa per </w:t>
+            </w:r>
+            <w:r>
+              <w:rPr>
                 <w:b/>
                 <w:sz w:val="17"/>
               </w:rPr>
-              <w:t>Una volta attivato non si può spegnere — per sicurezza</w:t>
-            </w:r>
-            <w:r>
-              <w:rPr>
-                <w:sz w:val="17"/>
-              </w:rPr>
-              <w:t xml:space="preserve">: la leva è a senso unico, nessun circuito di arresto. Per zittirne uno bisogna </w:t>
+              <w:t>ogni centrale nucleare</w:t>
+            </w:r>
+            <w:r>
+              <w:rPr>
+                <w:sz w:val="17"/>
+              </w:rPr>
+              <w:t xml:space="preserve"> e, se nessuno la ferma, </w:t>
             </w:r>
             <w:r>
               <w:rPr>
                 <w:b/>
                 <w:sz w:val="17"/>
               </w:rPr>
-              <w:t>demolirlo</w:t>
-            </w:r>
-            <w:r>
-              <w:rPr>
-                <w:sz w:val="17"/>
-              </w:rPr>
-              <w:t xml:space="preserve"> (trasduttore o generatore). L'unico «interruttore» dell'intera catena è </w:t>
+              <w:t>le distrugge tutte e otto</w:t>
+            </w:r>
+            <w:r>
+              <w:rPr>
+                <w:sz w:val="17"/>
+              </w:rPr>
+              <w:t xml:space="preserve"> (canone utente 2026-08-20): un faro a Genkai, Shimane, Takahama, Ōi, Mihama, Fugen, Tsuruga, Kashiwazaki — più le riserve. Le uniche deviazioni della rotta non sono scelte dei fari: sono </w:t>
             </w:r>
             <w:r>
               <w:rPr>
                 <w:b/>
                 <w:sz w:val="17"/>
               </w:rPr>
-              <w:t>lo strumento</w:t>
-            </w:r>
-            <w:r>
-              <w:rPr>
-                <w:sz w:val="17"/>
-              </w:rPr>
-              <w:t xml:space="preserve"> (blocco 3)</w:t>
+              <w:t>il fastidio delle centrali termoelettriche</w:t>
+            </w:r>
+            <w:r>
+              <w:rPr>
+                <w:sz w:val="17"/>
+              </w:rPr>
+              <w:t xml:space="preserve"> (Karatsu g.1, Miyazu g.3 — scheda §6.2)</w:t>
             </w:r>
           </w:p>
         </w:tc>
@@ -17189,16 +17260,9 @@
             </w:pPr>
             <w:r>
               <w:rPr>
-                <w:b/>
                 <w:sz w:val="17"/>
               </w:rPr>
               <w:t>canone</w:t>
-            </w:r>
-            <w:r>
-              <w:rPr>
-                <w:sz w:val="17"/>
-              </w:rPr>
-              <w:t>; dettagli demolizione: proposta</w:t>
             </w:r>
           </w:p>
         </w:tc>
@@ -17214,9 +17278,10 @@
             </w:pPr>
             <w:r>
               <w:rPr>
-                <w:sz w:val="17"/>
-              </w:rPr>
-              <w:t>La tempistica</w:t>
+                <w:b/>
+                <w:sz w:val="17"/>
+              </w:rPr>
+              <w:t>Senza spegnimento</w:t>
             </w:r>
           </w:p>
         </w:tc>
@@ -17230,48 +17295,42 @@
             </w:pPr>
             <w:r>
               <w:rPr>
-                <w:sz w:val="17"/>
-              </w:rPr>
-              <w:t xml:space="preserve">Hanno cominciato a portarli </w:t>
-            </w:r>
-            <w:r>
-              <w:rPr>
                 <w:b/>
                 <w:sz w:val="17"/>
               </w:rPr>
-              <w:t>5-6 giorni prima</w:t>
-            </w:r>
-            <w:r>
-              <w:rPr>
-                <w:sz w:val="17"/>
-              </w:rPr>
-              <w:t xml:space="preserve"> dell'emersione (11/11), </w:t>
+              <w:t>Una volta attivato non si può spegnere — per sicurezza</w:t>
+            </w:r>
+            <w:r>
+              <w:rPr>
+                <w:sz w:val="17"/>
+              </w:rPr>
+              <w:t xml:space="preserve">: la leva è a senso unico, nessun circuito di arresto. Per zittirne uno bisogna </w:t>
             </w:r>
             <w:r>
               <w:rPr>
                 <w:b/>
                 <w:sz w:val="17"/>
               </w:rPr>
-              <w:t>quasi contemporaneamente in tutti i punti</w:t>
-            </w:r>
-            <w:r>
-              <w:rPr>
-                <w:sz w:val="17"/>
-              </w:rPr>
-              <w:t xml:space="preserve"> del percorso: </w:t>
+              <w:t>demolirlo</w:t>
+            </w:r>
+            <w:r>
+              <w:rPr>
+                <w:sz w:val="17"/>
+              </w:rPr>
+              <w:t xml:space="preserve"> (trasduttore o generatore). L'unico «interruttore» dell'intera catena è </w:t>
             </w:r>
             <w:r>
               <w:rPr>
                 <w:b/>
                 <w:sz w:val="17"/>
               </w:rPr>
-              <w:t>5-6 novembre</w:t>
-            </w:r>
-            <w:r>
-              <w:rPr>
-                <w:sz w:val="17"/>
-              </w:rPr>
-              <w:t>, da Kyūshū a Niigata</w:t>
+              <w:t>lo strumento</w:t>
+            </w:r>
+            <w:r>
+              <w:rPr>
+                <w:sz w:val="17"/>
+              </w:rPr>
+              <w:t xml:space="preserve"> (blocco 3)</w:t>
             </w:r>
           </w:p>
         </w:tc>
@@ -17285,9 +17344,16 @@
             </w:pPr>
             <w:r>
               <w:rPr>
-                <w:sz w:val="17"/>
-              </w:rPr>
-              <w:t>canone (date #31)</w:t>
+                <w:b/>
+                <w:sz w:val="17"/>
+              </w:rPr>
+              <w:t>canone</w:t>
+            </w:r>
+            <w:r>
+              <w:rPr>
+                <w:sz w:val="17"/>
+              </w:rPr>
+              <w:t>; dettagli demolizione: proposta</w:t>
             </w:r>
           </w:p>
         </w:tc>
@@ -17305,6 +17371,95 @@
               <w:rPr>
                 <w:sz w:val="17"/>
               </w:rPr>
+              <w:t>La tempistica</w:t>
+            </w:r>
+          </w:p>
+        </w:tc>
+        <w:tc>
+          <w:tcPr>
+            <w:tcW w:type="dxa" w:w="3475"/>
+          </w:tcPr>
+          <w:p>
+            <w:pPr>
+              <w:spacing w:after="20"/>
+            </w:pPr>
+            <w:r>
+              <w:rPr>
+                <w:sz w:val="17"/>
+              </w:rPr>
+              <w:t xml:space="preserve">Hanno cominciato a portarli </w:t>
+            </w:r>
+            <w:r>
+              <w:rPr>
+                <w:b/>
+                <w:sz w:val="17"/>
+              </w:rPr>
+              <w:t>5-6 giorni prima</w:t>
+            </w:r>
+            <w:r>
+              <w:rPr>
+                <w:sz w:val="17"/>
+              </w:rPr>
+              <w:t xml:space="preserve"> dell'emersione (11/11), </w:t>
+            </w:r>
+            <w:r>
+              <w:rPr>
+                <w:b/>
+                <w:sz w:val="17"/>
+              </w:rPr>
+              <w:t>quasi contemporaneamente in tutti i punti</w:t>
+            </w:r>
+            <w:r>
+              <w:rPr>
+                <w:sz w:val="17"/>
+              </w:rPr>
+              <w:t xml:space="preserve"> del percorso: </w:t>
+            </w:r>
+            <w:r>
+              <w:rPr>
+                <w:b/>
+                <w:sz w:val="17"/>
+              </w:rPr>
+              <w:t>5-6 novembre</w:t>
+            </w:r>
+            <w:r>
+              <w:rPr>
+                <w:sz w:val="17"/>
+              </w:rPr>
+              <w:t>, da Kyūshū a Niigata</w:t>
+            </w:r>
+          </w:p>
+        </w:tc>
+        <w:tc>
+          <w:tcPr>
+            <w:tcW w:type="dxa" w:w="3475"/>
+          </w:tcPr>
+          <w:p>
+            <w:pPr>
+              <w:spacing w:after="20"/>
+            </w:pPr>
+            <w:r>
+              <w:rPr>
+                <w:sz w:val="17"/>
+              </w:rPr>
+              <w:t>canone (date #31)</w:t>
+            </w:r>
+          </w:p>
+        </w:tc>
+      </w:tr>
+      <w:tr>
+        <w:tc>
+          <w:tcPr>
+            <w:tcW w:type="dxa" w:w="3475"/>
+          </w:tcPr>
+          <w:p>
+            <w:pPr>
+              <w:spacing w:after="20"/>
+            </w:pPr>
+            <w:r>
+              <w:rPr>
+                <w:sz w:val="17"/>
+              </w:rPr>
               <w:t>Quanti</w:t>
             </w:r>
           </w:p>
@@ -17322,13 +17477,33 @@
                 <w:b/>
                 <w:sz w:val="17"/>
               </w:rPr>
-              <w:t>Una decina: un faro per bersaglio, più le riserve</w:t>
-            </w:r>
-            <w:r>
-              <w:rPr>
-                <w:sz w:val="17"/>
-              </w:rPr>
-              <w:t xml:space="preserve"> (in acqua il richiamo porta per centinaia di km — non serve una catena fitta); il numero esatto lo fissa la mappa (sotto)</w:t>
+              <w:t>DUE per centrale: il faro + il mezzo di supporto</w:t>
+            </w:r>
+            <w:r>
+              <w:rPr>
+                <w:sz w:val="17"/>
+              </w:rPr>
+              <w:t xml:space="preserve"> («due unità per posizione» — la lettera di bordo) = </w:t>
+            </w:r>
+            <w:r>
+              <w:rPr>
+                <w:b/>
+                <w:sz w:val="17"/>
+              </w:rPr>
+              <w:t>16 sulla rotta</w:t>
+            </w:r>
+            <w:r>
+              <w:rPr>
+                <w:sz w:val="17"/>
+              </w:rPr>
+              <w:t xml:space="preserve">, più eventuali riserve. </w:t>
+            </w:r>
+            <w:r>
+              <w:rPr>
+                <w:i/>
+                <w:sz w:val="17"/>
+              </w:rPr>
+              <w:t>(Interpretazione: il supporto è la ridondanza della tappa — se la polizia demolisce il faro attivo, il supporto accende il suo: per salvare una centrale vanno zittiti ENTRAMBI)</w:t>
             </w:r>
           </w:p>
         </w:tc>
@@ -17342,9 +17517,16 @@
             </w:pPr>
             <w:r>
               <w:rPr>
-                <w:sz w:val="17"/>
-              </w:rPr>
-              <w:t>proposta</w:t>
+                <w:b/>
+                <w:sz w:val="17"/>
+              </w:rPr>
+              <w:t>canone utente 2026-08-23</w:t>
+            </w:r>
+            <w:r>
+              <w:rPr>
+                <w:sz w:val="17"/>
+              </w:rPr>
+              <w:t xml:space="preserve"> (due per centrale); interpretazione da validare</w:t>
             </w:r>
           </w:p>
         </w:tc>
@@ -18043,7 +18225,7 @@
           <w:i/>
           <w:sz w:val="19"/>
         </w:rPr>
-        <w:t>(canone 2026-08-21)</w:t>
+        <w:t>(canone 2026-08-21; agg. 2026-08-23 col supporto)</w:t>
       </w:r>
       <w:r>
         <w:rPr>
@@ -18056,52 +18238,86 @@
           <w:b/>
           <w:sz w:val="19"/>
         </w:rPr>
-        <w:t>demolire il faro attivo prima dello sbarco salva quella centrale</w:t>
+        <w:t>per salvare una centrale vanno zittiti il faro E il suo supporto prima dello sbarco</w:t>
       </w:r>
       <w:r>
         <w:rPr>
           <w:sz w:val="19"/>
         </w:rPr>
-        <w:t xml:space="preserve"> — la squadra del successivo, vedendo morire il segnale, accende il proprio (la catena si auto-ripara) e la bestia tira dritto, al largo, verso il faro dopo. </w:t>
+        <w:t xml:space="preserve"> — morto il segnale della tappa, la squadra della tappa successiva accende il proprio (la catena si auto-ripara) e la bestia tira dritto, al largo, verso il faro dopo. </w:t>
       </w:r>
       <w:r>
         <w:rPr>
           <w:b/>
           <w:sz w:val="19"/>
         </w:rPr>
-        <w:t>Ogni camion ucciso è una centrale salvata</w:t>
+        <w:t>Se vengono distrutti TUTTI, il mostro torna all'acqua</w:t>
       </w:r>
       <w:r>
         <w:rPr>
           <w:sz w:val="19"/>
         </w:rPr>
-        <w:t xml:space="preserve">; </w:t>
+        <w:t xml:space="preserve"> — è la seconda via di vittoria, accanto al disturbatore. E </w:t>
       </w:r>
       <w:r>
         <w:rPr>
           <w:b/>
           <w:sz w:val="19"/>
         </w:rPr>
-        <w:t>se vengono distrutti TUTTI, il mostro torna all'acqua</w:t>
+        <w:t>un prigioniero di un camioncino può rivelare il capannone</w:t>
       </w:r>
       <w:r>
         <w:rPr>
           <w:sz w:val="19"/>
         </w:rPr>
-        <w:t xml:space="preserve"> — è la seconda via di vittoria, accanto al disturbatore. E </w:t>
-      </w:r>
+        <w:t xml:space="preserve"> (come l'ostaggio della consegna: credendolo ormai vuoto).</w:t>
+      </w:r>
+    </w:p>
+    <w:p>
+      <w:pPr>
+        <w:pBdr>
+          <w:left w:val="single" w:sz="12" w:space="6" w:color="999999"/>
+        </w:pBdr>
+        <w:ind w:left="198"/>
+      </w:pPr>
       <w:r>
         <w:rPr>
           <w:b/>
           <w:sz w:val="19"/>
         </w:rPr>
-        <w:t>un prigioniero di un camioncino può rivelare il capannone</w:t>
+        <w:t>Handout pronto</w:t>
       </w:r>
       <w:r>
         <w:rPr>
           <w:sz w:val="19"/>
         </w:rPr>
-        <w:t xml:space="preserve"> (come l'ostaggio della consegna: credendolo ormai vuoto).</w:t>
+        <w:t xml:space="preserve">: </w:t>
+      </w:r>
+      <w:r>
+        <w:rPr>
+          <w:b/>
+          <w:sz w:val="19"/>
+        </w:rPr>
+        <w:t>`HANDOUT_CAMIONCINO.html`</w:t>
+      </w:r>
+      <w:r>
+        <w:rPr>
+          <w:sz w:val="19"/>
+        </w:rPr>
+        <w:t xml:space="preserve"> — il rapporto d'esame del camioncino catturato (meccanismo del richiamo + la carica) con la </w:t>
+      </w:r>
+      <w:r>
+        <w:rPr>
+          <w:b/>
+          <w:sz w:val="19"/>
+        </w:rPr>
+        <w:t>lettera di bordo</w:t>
+      </w:r>
+      <w:r>
+        <w:rPr>
+          <w:sz w:val="19"/>
+        </w:rPr>
+        <w:t>: trasferimento al punto ７, il mezzo di supporto («due unità per posizione»), la procedura di demolizione. Data e numeri di protocollo da compilare a penna.</w:t>
       </w:r>
     </w:p>
     <w:p>
@@ -22135,6 +22351,129 @@
       </w:r>
     </w:p>
     <w:p>
+      <w:pPr>
+        <w:pStyle w:val="ListNumber"/>
+        <w:spacing w:after="40"/>
+      </w:pPr>
+      <w:r>
+        <w:rPr>
+          <w:b/>
+          <w:sz w:val="20"/>
+        </w:rPr>
+        <w:t>La demolizione</w:t>
+      </w:r>
+      <w:r>
+        <w:rPr>
+          <w:sz w:val="20"/>
+        </w:rPr>
+        <w:t xml:space="preserve"> </w:t>
+      </w:r>
+      <w:r>
+        <w:rPr>
+          <w:i/>
+          <w:sz w:val="20"/>
+        </w:rPr>
+        <w:t>(canone utente 2026-08-23)</w:t>
+      </w:r>
+      <w:r>
+        <w:rPr>
+          <w:sz w:val="20"/>
+        </w:rPr>
+        <w:t xml:space="preserve">: </w:t>
+      </w:r>
+      <w:r>
+        <w:rPr>
+          <w:b/>
+          <w:sz w:val="20"/>
+        </w:rPr>
+        <w:t>se scoperti e alle strette</w:t>
+      </w:r>
+      <w:r>
+        <w:rPr>
+          <w:sz w:val="20"/>
+        </w:rPr>
+        <w:t xml:space="preserve"> — il camion non si può portare via, i PG stanno vincendo — il caposquadra </w:t>
+      </w:r>
+      <w:r>
+        <w:rPr>
+          <w:b/>
+          <w:sz w:val="20"/>
+        </w:rPr>
+        <w:t>attiva la carica</w:t>
+      </w:r>
+      <w:r>
+        <w:rPr>
+          <w:sz w:val="20"/>
+        </w:rPr>
+        <w:t xml:space="preserve">: </w:t>
+      </w:r>
+      <w:r>
+        <w:rPr>
+          <w:b/>
+          <w:sz w:val="20"/>
+        </w:rPr>
+        <w:t>un minuto di timer</w:t>
+      </w:r>
+      <w:r>
+        <w:rPr>
+          <w:sz w:val="20"/>
+        </w:rPr>
+        <w:t xml:space="preserve">, e la squadra scappa in direzioni separate. Il vano salta con ogni prova dentro. Vale anche sul faro attivo: le prove contano più del faro — </w:t>
+      </w:r>
+      <w:r>
+        <w:rPr>
+          <w:b/>
+          <w:sz w:val="20"/>
+        </w:rPr>
+        <w:t>il mezzo di supporto della tappa accenderà il suo</w:t>
+      </w:r>
+      <w:r>
+        <w:rPr>
+          <w:sz w:val="20"/>
+        </w:rPr>
+        <w:t xml:space="preserve"> </w:t>
+      </w:r>
+      <w:r>
+        <w:rPr>
+          <w:i/>
+          <w:sz w:val="20"/>
+        </w:rPr>
+        <w:t>(interpretazione)</w:t>
+      </w:r>
+      <w:r>
+        <w:rPr>
+          <w:sz w:val="20"/>
+        </w:rPr>
+        <w:t xml:space="preserve">. Allo scoppio: danno 4 entro ~10 m, danno 2 fino a ~25 m </w:t>
+      </w:r>
+      <w:r>
+        <w:rPr>
+          <w:i/>
+          <w:sz w:val="20"/>
+        </w:rPr>
+        <w:t>(proposta)</w:t>
+      </w:r>
+      <w:r>
+        <w:rPr>
+          <w:sz w:val="20"/>
+        </w:rPr>
+        <w:t xml:space="preserve">. </w:t>
+      </w:r>
+      <w:r>
+        <w:rPr>
+          <w:b/>
+          <w:sz w:val="20"/>
+        </w:rPr>
+        <w:t>Un minuto è un minuto</w:t>
+      </w:r>
+      <w:r>
+        <w:rPr>
+          <w:sz w:val="20"/>
+        </w:rPr>
+        <w:t>: mettilo sul tavolo e falli scegliere — inseguire gli uomini, o strappare qualcosa dal camion.</w:t>
+      </w:r>
+    </w:p>
+    <w:p>
       <w:r>
         <w:rPr>
           <w:b/>
@@ -22205,7 +22544,27 @@
       </w:r>
       <w:r>
         <w:rPr/>
-        <w:t xml:space="preserve"> (regola del buio). Camion dormiente preso intero → la tecnologia in mano ai PG.</w:t>
+        <w:t xml:space="preserve"> (regola del buio). Camion preso intero = squadra sorpresa </w:t>
+      </w:r>
+      <w:r>
+        <w:rPr>
+          <w:b/>
+        </w:rPr>
+        <w:t>prima dell'innesco</w:t>
+      </w:r>
+      <w:r>
+        <w:rPr/>
+        <w:t xml:space="preserve">: la tecnologia in mano ai PG — e la carica da far disinnescare (artificieri, qualche ora). L'esame del mezzo = handout pronto: </w:t>
+      </w:r>
+      <w:r>
+        <w:rPr>
+          <w:b/>
+        </w:rPr>
+        <w:t>`HANDOUT_CAMIONCINO.html`</w:t>
+      </w:r>
+      <w:r>
+        <w:rPr/>
+        <w:t xml:space="preserve"> (rapporto tecnico + la lettera del trasferimento).</w:t>
       </w:r>
     </w:p>
     <w:p>
@@ -38923,7 +39282,17 @@
       </w:r>
       <w:r>
         <w:rPr/>
-        <w:t xml:space="preserve"> con Kashiwazaki cerchiata (HANDOUT_MAPPA_CAPOSETTORE.html — da consegnare piegato dentro una carta stradale vera) · la </w:t>
+        <w:t xml:space="preserve"> con Kashiwazaki cerchiata (HANDOUT_MAPPA_CAPOSETTORE.html — da consegnare piegato dentro una carta stradale vera) · </w:t>
+      </w:r>
+      <w:r>
+        <w:rPr>
+          <w:b/>
+        </w:rPr>
+        <w:t>l'esame del camioncino catturato</w:t>
+      </w:r>
+      <w:r>
+        <w:rPr/>
+        <w:t xml:space="preserve"> (HANDOUT_CAMIONCINO.html: rapporto tecnico + lettera di bordo; data e protocolli da compilare a penna) · la </w:t>
       </w:r>
       <w:r>
         <w:rPr>

</xml_diff>